<commit_message>
phase2Vars::fill and small changes
</commit_message>
<xml_diff>
--- a/test/ResultDescr.docx
+++ b/test/ResultDescr.docx
@@ -919,14 +919,7 @@
             <w:rFonts w:ascii="Cambria Math" w:hAnsi="Cambria Math"/>
             <w:lang w:val="en-US"/>
           </w:rPr>
-          <m:t>μ</m:t>
-        </m:r>
-        <m:r>
-          <w:rPr>
-            <w:rFonts w:ascii="Cambria Math" w:hAnsi="Cambria Math"/>
-            <w:lang w:val="en-US"/>
-          </w:rPr>
-          <m:t>&gt;</m:t>
+          <m:t>μ&gt;</m:t>
         </m:r>
         <m:sSub>
           <m:sSubPr>
@@ -1036,14 +1029,7 @@
             <w:rFonts w:ascii="Cambria Math" w:hAnsi="Cambria Math"/>
             <w:lang w:val="en-US"/>
           </w:rPr>
-          <m:t>μ</m:t>
-        </m:r>
-        <m:r>
-          <w:rPr>
-            <w:rFonts w:ascii="Cambria Math" w:hAnsi="Cambria Math"/>
-            <w:lang w:val="en-US"/>
-          </w:rPr>
-          <m:t>=</m:t>
+          <m:t>μ=</m:t>
         </m:r>
         <m:sSub>
           <m:sSubPr>
@@ -1459,11 +1445,13 @@
         <w:rPr>
           <w:lang w:val="en-US"/>
         </w:rPr>
+        <w:lastRenderedPageBreak/>
         <w:t xml:space="preserve">We add </w:t>
       </w:r>
       <w:proofErr w:type="spellStart"/>
       <w:r>
         <w:rPr>
+          <w:b/>
           <w:lang w:val="en-US"/>
         </w:rPr>
         <w:t>ncall</w:t>
@@ -1488,6 +1476,84 @@
           <w:lang w:val="en-US"/>
         </w:rPr>
         <w:t xml:space="preserve"> to gCOP.py</w:t>
+      </w:r>
+      <w:r>
+        <w:rPr>
+          <w:lang w:val="en-US"/>
+        </w:rPr>
+        <w:t xml:space="preserve"> (</w:t>
+      </w:r>
+      <w:proofErr w:type="spellStart"/>
+      <w:r>
+        <w:rPr>
+          <w:lang w:val="en-US"/>
+        </w:rPr>
+        <w:t>ncall</w:t>
+      </w:r>
+      <w:proofErr w:type="spellEnd"/>
+      <w:r>
+        <w:rPr>
+          <w:lang w:val="en-US"/>
+        </w:rPr>
+        <w:t xml:space="preserve"> is the real number of </w:t>
+      </w:r>
+      <w:proofErr w:type="spellStart"/>
+      <w:r>
+        <w:rPr>
+          <w:lang w:val="en-US"/>
+        </w:rPr>
+        <w:t>gcop</w:t>
+      </w:r>
+      <w:proofErr w:type="spellEnd"/>
+      <w:r>
+        <w:rPr>
+          <w:lang w:val="en-US"/>
+        </w:rPr>
+        <w:t xml:space="preserve"> function calls. In principle, it should match </w:t>
+      </w:r>
+      <w:proofErr w:type="spellStart"/>
+      <w:r>
+        <w:rPr>
+          <w:lang w:val="en-US"/>
+        </w:rPr>
+        <w:t>feval</w:t>
+      </w:r>
+      <w:proofErr w:type="spellEnd"/>
+      <w:r>
+        <w:rPr>
+          <w:lang w:val="en-US"/>
+        </w:rPr>
+        <w:t xml:space="preserve">, but due to diagnostic calls of </w:t>
+      </w:r>
+      <w:proofErr w:type="spellStart"/>
+      <w:proofErr w:type="gramStart"/>
+      <w:r>
+        <w:rPr>
+          <w:lang w:val="en-US"/>
+        </w:rPr>
+        <w:t>gcop.fn</w:t>
+      </w:r>
+      <w:proofErr w:type="spellEnd"/>
+      <w:proofErr w:type="gramEnd"/>
+      <w:r>
+        <w:rPr>
+          <w:lang w:val="en-US"/>
+        </w:rPr>
+        <w:t xml:space="preserve">, </w:t>
+      </w:r>
+      <w:proofErr w:type="spellStart"/>
+      <w:r>
+        <w:rPr>
+          <w:lang w:val="en-US"/>
+        </w:rPr>
+        <w:t>ncall</w:t>
+      </w:r>
+      <w:proofErr w:type="spellEnd"/>
+      <w:r>
+        <w:rPr>
+          <w:lang w:val="en-US"/>
+        </w:rPr>
+        <w:t xml:space="preserve"> may be higher. </w:t>
       </w:r>
     </w:p>
     <w:p>
@@ -1505,7 +1571,6 @@
         <w:rPr>
           <w:lang w:val="en-US"/>
         </w:rPr>
-        <w:lastRenderedPageBreak/>
         <w:t xml:space="preserve">We group </w:t>
       </w:r>
       <w:proofErr w:type="spellStart"/>
@@ -2004,13 +2069,7 @@
         <w:rPr>
           <w:lang w:val="en-US"/>
         </w:rPr>
-        <w:t xml:space="preserve">stored to </w:t>
-      </w:r>
-      <w:r>
-        <w:rPr>
-          <w:lang w:val="en-US"/>
-        </w:rPr>
-        <w:t>{</w:t>
+        <w:t>stored to {</w:t>
       </w:r>
       <w:proofErr w:type="spellStart"/>
       <w:r>
@@ -2024,13 +2083,7 @@
         <w:rPr>
           <w:lang w:val="en-US"/>
         </w:rPr>
-        <w:t>}/{gname}_{run}.</w:t>
-      </w:r>
-      <w:r>
-        <w:rPr>
-          <w:lang w:val="en-US"/>
-        </w:rPr>
-        <w:t>png</w:t>
+        <w:t>}/{gname}_{run}.png</w:t>
       </w:r>
     </w:p>
     <w:p>
@@ -2495,6 +2548,228 @@
           <w:lang w:val="en-US"/>
         </w:rPr>
       </w:pPr>
+      <w:r>
+        <w:rPr>
+          <w:lang w:val="en-US"/>
+        </w:rPr>
+        <w:t xml:space="preserve">2026-01-20: We noticed a bug in result production: The </w:t>
+      </w:r>
+      <w:proofErr w:type="gramStart"/>
+      <w:r>
+        <w:rPr>
+          <w:lang w:val="en-US"/>
+        </w:rPr>
+        <w:t>G..-</w:t>
+      </w:r>
+      <w:proofErr w:type="gramEnd"/>
+      <w:r>
+        <w:rPr>
+          <w:lang w:val="en-US"/>
+        </w:rPr>
+        <w:t>files for each run are only stored under the name G01_00.png, e.g. {</w:t>
+      </w:r>
+      <w:proofErr w:type="spellStart"/>
+      <w:r>
+        <w:rPr>
+          <w:lang w:val="en-US"/>
+        </w:rPr>
+        <w:t>gname</w:t>
+      </w:r>
+      <w:proofErr w:type="spellEnd"/>
+      <w:r>
+        <w:rPr>
+          <w:lang w:val="en-US"/>
+        </w:rPr>
+        <w:t>}_{run}. This is wrong if we call G02 or G03 with different dimensions: only the last-dimension files will survive. Fix: change the name to {</w:t>
+      </w:r>
+      <w:proofErr w:type="spellStart"/>
+      <w:r>
+        <w:rPr>
+          <w:lang w:val="en-US"/>
+        </w:rPr>
+        <w:t>gname</w:t>
+      </w:r>
+      <w:proofErr w:type="spellEnd"/>
+      <w:r>
+        <w:rPr>
+          <w:lang w:val="en-US"/>
+        </w:rPr>
+        <w:t>}_{dim</w:t>
+      </w:r>
+      <w:r>
+        <w:rPr>
+          <w:lang w:val="en-US"/>
+        </w:rPr>
+        <w:t>ension</w:t>
+      </w:r>
+      <w:r>
+        <w:rPr>
+          <w:lang w:val="en-US"/>
+        </w:rPr>
+        <w:t>}_{run}.</w:t>
+      </w:r>
+    </w:p>
+    <w:p>
+      <w:pPr>
+        <w:pStyle w:val="Listenabsatz"/>
+        <w:numPr>
+          <w:ilvl w:val="0"/>
+          <w:numId w:val="2"/>
+        </w:numPr>
+        <w:rPr>
+          <w:lang w:val="en-US"/>
+        </w:rPr>
+      </w:pPr>
+      <w:r>
+        <w:rPr>
+          <w:lang w:val="en-US"/>
+        </w:rPr>
+        <w:t>Likewise,</w:t>
+      </w:r>
+      <w:r>
+        <w:rPr>
+          <w:lang w:val="en-US"/>
+        </w:rPr>
+        <w:t xml:space="preserve"> </w:t>
+      </w:r>
+      <w:r>
+        <w:rPr>
+          <w:lang w:val="en-US"/>
+        </w:rPr>
+        <w:t>t</w:t>
+      </w:r>
+      <w:r>
+        <w:rPr>
+          <w:lang w:val="en-US"/>
+        </w:rPr>
+        <w:t xml:space="preserve">he input space dimension was missing from the title in </w:t>
+      </w:r>
+      <w:proofErr w:type="spellStart"/>
+      <w:r>
+        <w:rPr>
+          <w:lang w:val="en-US"/>
+        </w:rPr>
+        <w:t>png_error_plot</w:t>
+      </w:r>
+      <w:proofErr w:type="spellEnd"/>
+      <w:r>
+        <w:rPr>
+          <w:lang w:val="en-US"/>
+        </w:rPr>
+        <w:t>. Now fixed.</w:t>
+      </w:r>
+    </w:p>
+    <w:p>
+      <w:pPr>
+        <w:pStyle w:val="berschrift1"/>
+        <w:rPr>
+          <w:lang w:val="en-US"/>
+        </w:rPr>
+      </w:pPr>
+      <w:r>
+        <w:rPr>
+          <w:lang w:val="en-US"/>
+        </w:rPr>
+        <w:t xml:space="preserve">Outline SACOBRA </w:t>
+      </w:r>
+      <w:proofErr w:type="spellStart"/>
+      <w:r>
+        <w:rPr>
+          <w:lang w:val="en-US"/>
+        </w:rPr>
+        <w:t>arXiv</w:t>
+      </w:r>
+      <w:proofErr w:type="spellEnd"/>
+      <w:r>
+        <w:rPr>
+          <w:lang w:val="en-US"/>
+        </w:rPr>
+        <w:t xml:space="preserve"> paper</w:t>
+      </w:r>
+    </w:p>
+    <w:p>
+      <w:pPr>
+        <w:rPr>
+          <w:lang w:val="en-US"/>
+        </w:rPr>
+      </w:pPr>
+      <w:r>
+        <w:rPr>
+          <w:lang w:val="en-US"/>
+        </w:rPr>
+        <w:t xml:space="preserve">What are potential new findings? </w:t>
+      </w:r>
+    </w:p>
+    <w:p>
+      <w:pPr>
+        <w:pStyle w:val="Listenabsatz"/>
+        <w:numPr>
+          <w:ilvl w:val="0"/>
+          <w:numId w:val="3"/>
+        </w:numPr>
+        <w:rPr>
+          <w:lang w:val="en-US"/>
+        </w:rPr>
+      </w:pPr>
+      <w:proofErr w:type="spellStart"/>
+      <w:r>
+        <w:rPr>
+          <w:lang w:val="en-US"/>
+        </w:rPr>
+        <w:t>SACOBRA_Py</w:t>
+      </w:r>
+      <w:proofErr w:type="spellEnd"/>
+      <w:r>
+        <w:rPr>
+          <w:lang w:val="en-US"/>
+        </w:rPr>
+        <w:t xml:space="preserve"> much faster than R</w:t>
+      </w:r>
+    </w:p>
+    <w:p>
+      <w:pPr>
+        <w:pStyle w:val="Listenabsatz"/>
+        <w:numPr>
+          <w:ilvl w:val="0"/>
+          <w:numId w:val="3"/>
+        </w:numPr>
+        <w:rPr>
+          <w:lang w:val="en-US"/>
+        </w:rPr>
+      </w:pPr>
+      <w:r>
+        <w:rPr>
+          <w:lang w:val="en-US"/>
+        </w:rPr>
+        <w:t>Improved GCOP-solutions for equality case</w:t>
+      </w:r>
+    </w:p>
+    <w:p>
+      <w:pPr>
+        <w:pStyle w:val="Listenabsatz"/>
+        <w:numPr>
+          <w:ilvl w:val="0"/>
+          <w:numId w:val="3"/>
+        </w:numPr>
+        <w:rPr>
+          <w:lang w:val="en-US"/>
+        </w:rPr>
+      </w:pPr>
+      <w:r>
+        <w:rPr>
+          <w:lang w:val="en-US"/>
+        </w:rPr>
+        <w:t xml:space="preserve">Benefits of periodically enlarging </w:t>
+      </w:r>
+      <m:oMath>
+        <m:r>
+          <w:rPr>
+            <w:rFonts w:ascii="Cambria Math" w:hAnsi="Cambria Math"/>
+            <w:lang w:val="en-US"/>
+          </w:rPr>
+          <m:t>μ</m:t>
+        </m:r>
+      </m:oMath>
     </w:p>
     <w:p>
       <w:pPr>
@@ -2516,6 +2791,119 @@
 <file path=word/numbering.xml><?xml version="1.0" encoding="utf-8"?>
 <w:numbering xmlns:wpc="http://schemas.microsoft.com/office/word/2010/wordprocessingCanvas" xmlns:cx="http://schemas.microsoft.com/office/drawing/2014/chartex" xmlns:cx1="http://schemas.microsoft.com/office/drawing/2015/9/8/chartex" xmlns:cx2="http://schemas.microsoft.com/office/drawing/2015/10/21/chartex" xmlns:cx3="http://schemas.microsoft.com/office/drawing/2016/5/9/chartex" xmlns:cx4="http://schemas.microsoft.com/office/drawing/2016/5/10/chartex" xmlns:cx5="http://schemas.microsoft.com/office/drawing/2016/5/11/chartex" xmlns:cx6="http://schemas.microsoft.com/office/drawing/2016/5/12/chartex" xmlns:cx7="http://schemas.microsoft.com/office/drawing/2016/5/13/chartex" xmlns:cx8="http://schemas.microsoft.com/office/drawing/2016/5/14/chartex" xmlns:mc="http://schemas.openxmlformats.org/markup-compatibility/2006" xmlns:aink="http://schemas.microsoft.com/office/drawing/2016/ink" xmlns:am3d="http://schemas.microsoft.com/office/drawing/2017/model3d" xmlns:o="urn:schemas-microsoft-com:office:office" xmlns:r="http://schemas.openxmlformats.org/officeDocument/2006/relationships" xmlns:m="http://schemas.openxmlformats.org/officeDocument/2006/math" xmlns:v="urn:schemas-microsoft-com:vml" xmlns:wp14="http://schemas.microsoft.com/office/word/2010/wordprocessingDrawing" xmlns:wp="http://schemas.openxmlformats.org/drawingml/2006/wordprocessingDrawing" xmlns:w10="urn:schemas-microsoft-com:office:word" xmlns:w="http://schemas.openxmlformats.org/wordprocessingml/2006/main" xmlns:w14="http://schemas.microsoft.com/office/word/2010/wordml" xmlns:w15="http://schemas.microsoft.com/office/word/2012/wordml" xmlns:w16cex="http://schemas.microsoft.com/office/word/2018/wordml/cex" xmlns:w16cid="http://schemas.microsoft.com/office/word/2016/wordml/cid" xmlns:w16="http://schemas.microsoft.com/office/word/2018/wordml" xmlns:w16sdtdh="http://schemas.microsoft.com/office/word/2020/wordml/sdtdatahash" xmlns:w16se="http://schemas.microsoft.com/office/word/2015/wordml/symex" xmlns:wpg="http://schemas.microsoft.com/office/word/2010/wordprocessingGroup" xmlns:wpi="http://schemas.microsoft.com/office/word/2010/wordprocessingInk" xmlns:wne="http://schemas.microsoft.com/office/word/2006/wordml" xmlns:wps="http://schemas.microsoft.com/office/word/2010/wordprocessingShape" mc:Ignorable="w14 w15 w16se w16cid w16 w16cex w16sdtdh wp14">
   <w:abstractNum w:abstractNumId="0" w15:restartNumberingAfterBreak="0">
+    <w:nsid w:val="2ACA3638"/>
+    <w:multiLevelType w:val="hybridMultilevel"/>
+    <w:tmpl w:val="A3D4AB9A"/>
+    <w:lvl w:ilvl="0" w:tplc="04070001">
+      <w:start w:val="1"/>
+      <w:numFmt w:val="bullet"/>
+      <w:lvlText w:val=""/>
+      <w:lvlJc w:val="left"/>
+      <w:pPr>
+        <w:ind w:left="720" w:hanging="360"/>
+      </w:pPr>
+      <w:rPr>
+        <w:rFonts w:ascii="Symbol" w:hAnsi="Symbol" w:hint="default"/>
+      </w:rPr>
+    </w:lvl>
+    <w:lvl w:ilvl="1" w:tplc="04070003" w:tentative="1">
+      <w:start w:val="1"/>
+      <w:numFmt w:val="bullet"/>
+      <w:lvlText w:val="o"/>
+      <w:lvlJc w:val="left"/>
+      <w:pPr>
+        <w:ind w:left="1440" w:hanging="360"/>
+      </w:pPr>
+      <w:rPr>
+        <w:rFonts w:ascii="Courier New" w:hAnsi="Courier New" w:cs="Courier New" w:hint="default"/>
+      </w:rPr>
+    </w:lvl>
+    <w:lvl w:ilvl="2" w:tplc="04070005" w:tentative="1">
+      <w:start w:val="1"/>
+      <w:numFmt w:val="bullet"/>
+      <w:lvlText w:val=""/>
+      <w:lvlJc w:val="left"/>
+      <w:pPr>
+        <w:ind w:left="2160" w:hanging="360"/>
+      </w:pPr>
+      <w:rPr>
+        <w:rFonts w:ascii="Wingdings" w:hAnsi="Wingdings" w:hint="default"/>
+      </w:rPr>
+    </w:lvl>
+    <w:lvl w:ilvl="3" w:tplc="04070001" w:tentative="1">
+      <w:start w:val="1"/>
+      <w:numFmt w:val="bullet"/>
+      <w:lvlText w:val=""/>
+      <w:lvlJc w:val="left"/>
+      <w:pPr>
+        <w:ind w:left="2880" w:hanging="360"/>
+      </w:pPr>
+      <w:rPr>
+        <w:rFonts w:ascii="Symbol" w:hAnsi="Symbol" w:hint="default"/>
+      </w:rPr>
+    </w:lvl>
+    <w:lvl w:ilvl="4" w:tplc="04070003" w:tentative="1">
+      <w:start w:val="1"/>
+      <w:numFmt w:val="bullet"/>
+      <w:lvlText w:val="o"/>
+      <w:lvlJc w:val="left"/>
+      <w:pPr>
+        <w:ind w:left="3600" w:hanging="360"/>
+      </w:pPr>
+      <w:rPr>
+        <w:rFonts w:ascii="Courier New" w:hAnsi="Courier New" w:cs="Courier New" w:hint="default"/>
+      </w:rPr>
+    </w:lvl>
+    <w:lvl w:ilvl="5" w:tplc="04070005" w:tentative="1">
+      <w:start w:val="1"/>
+      <w:numFmt w:val="bullet"/>
+      <w:lvlText w:val=""/>
+      <w:lvlJc w:val="left"/>
+      <w:pPr>
+        <w:ind w:left="4320" w:hanging="360"/>
+      </w:pPr>
+      <w:rPr>
+        <w:rFonts w:ascii="Wingdings" w:hAnsi="Wingdings" w:hint="default"/>
+      </w:rPr>
+    </w:lvl>
+    <w:lvl w:ilvl="6" w:tplc="04070001" w:tentative="1">
+      <w:start w:val="1"/>
+      <w:numFmt w:val="bullet"/>
+      <w:lvlText w:val=""/>
+      <w:lvlJc w:val="left"/>
+      <w:pPr>
+        <w:ind w:left="5040" w:hanging="360"/>
+      </w:pPr>
+      <w:rPr>
+        <w:rFonts w:ascii="Symbol" w:hAnsi="Symbol" w:hint="default"/>
+      </w:rPr>
+    </w:lvl>
+    <w:lvl w:ilvl="7" w:tplc="04070003" w:tentative="1">
+      <w:start w:val="1"/>
+      <w:numFmt w:val="bullet"/>
+      <w:lvlText w:val="o"/>
+      <w:lvlJc w:val="left"/>
+      <w:pPr>
+        <w:ind w:left="5760" w:hanging="360"/>
+      </w:pPr>
+      <w:rPr>
+        <w:rFonts w:ascii="Courier New" w:hAnsi="Courier New" w:cs="Courier New" w:hint="default"/>
+      </w:rPr>
+    </w:lvl>
+    <w:lvl w:ilvl="8" w:tplc="04070005" w:tentative="1">
+      <w:start w:val="1"/>
+      <w:numFmt w:val="bullet"/>
+      <w:lvlText w:val=""/>
+      <w:lvlJc w:val="left"/>
+      <w:pPr>
+        <w:ind w:left="6480" w:hanging="360"/>
+      </w:pPr>
+      <w:rPr>
+        <w:rFonts w:ascii="Wingdings" w:hAnsi="Wingdings" w:hint="default"/>
+      </w:rPr>
+    </w:lvl>
+  </w:abstractNum>
+  <w:abstractNum w:abstractNumId="1" w15:restartNumberingAfterBreak="0">
     <w:nsid w:val="388B666E"/>
     <w:multiLevelType w:val="hybridMultilevel"/>
     <w:tmpl w:val="C3C294FA"/>
@@ -2628,7 +3016,7 @@
       </w:rPr>
     </w:lvl>
   </w:abstractNum>
-  <w:abstractNum w:abstractNumId="1" w15:restartNumberingAfterBreak="0">
+  <w:abstractNum w:abstractNumId="2" w15:restartNumberingAfterBreak="0">
     <w:nsid w:val="3C8A2B40"/>
     <w:multiLevelType w:val="hybridMultilevel"/>
     <w:tmpl w:val="F3940C32"/>
@@ -2742,9 +3130,12 @@
     </w:lvl>
   </w:abstractNum>
   <w:num w:numId="1">
+    <w:abstractNumId w:val="2"/>
+  </w:num>
+  <w:num w:numId="2">
     <w:abstractNumId w:val="1"/>
   </w:num>
-  <w:num w:numId="2">
+  <w:num w:numId="3">
     <w:abstractNumId w:val="0"/>
   </w:num>
 </w:numbering>

</xml_diff>